<commit_message>
Add cited reference extraction phase
</commit_message>
<xml_diff>
--- a/BatLit_Pre-Zotero_Methods.docx
+++ b/BatLit_Pre-Zotero_Methods.docx
@@ -513,6 +513,96 @@
         <w:t>The pipeline writes CSV and XLSX bibliographies for each routed folder, collection-level action logs, routing reports, dedupe reports, metadata embedding reports, and timestamped manifests. These files preserve the decisions made for each PDF and allow later reconstruction of what was added, excluded, or sent to manual review.</w:t>
       </w:r>
     </w:p>
+    <w:p>
+      <w:pPr>
+        <w:pStyle w:val="Heading1"/>
+      </w:pPr>
+      <w:r>
+        <w:t>Citation Network Seed Extraction</w:t>
+      </w:r>
+    </w:p>
+    <w:p>
+      <w:pPr>
+        <w:spacing w:after="160"/>
+      </w:pPr>
+      <w:r>
+        <w:rPr>
+          <w:rFonts w:ascii="Arial" w:hAnsi="Arial"/>
+          <w:b w:val="0"/>
+          <w:color w:val="000000"/>
+          <w:sz w:val="22"/>
+        </w:rPr>
+        <w:t xml:space="preserve">A citation-network phase was added as an optional downstream step. The workflow scans duplicate-omitted review sets, extracts full text, identifies the cited-reference section using common headings such as </w:t>
+      </w:r>
+      <w:r>
+        <w:rPr>
+          <w:rFonts w:ascii="Courier New" w:hAnsi="Courier New"/>
+          <w:b w:val="0"/>
+          <w:color w:val="333333"/>
+          <w:sz w:val="20"/>
+        </w:rPr>
+        <w:t>References</w:t>
+      </w:r>
+      <w:r>
+        <w:rPr>
+          <w:rFonts w:ascii="Arial" w:hAnsi="Arial"/>
+          <w:b w:val="0"/>
+          <w:color w:val="000000"/>
+          <w:sz w:val="22"/>
+        </w:rPr>
+        <w:t xml:space="preserve">, </w:t>
+      </w:r>
+      <w:r>
+        <w:rPr>
+          <w:rFonts w:ascii="Courier New" w:hAnsi="Courier New"/>
+          <w:b w:val="0"/>
+          <w:color w:val="333333"/>
+          <w:sz w:val="20"/>
+        </w:rPr>
+        <w:t>Literature cited</w:t>
+      </w:r>
+      <w:r>
+        <w:rPr>
+          <w:rFonts w:ascii="Arial" w:hAnsi="Arial"/>
+          <w:b w:val="0"/>
+          <w:color w:val="000000"/>
+          <w:sz w:val="22"/>
+        </w:rPr>
+        <w:t xml:space="preserve">, and </w:t>
+      </w:r>
+      <w:r>
+        <w:rPr>
+          <w:rFonts w:ascii="Courier New" w:hAnsi="Courier New"/>
+          <w:b w:val="0"/>
+          <w:color w:val="333333"/>
+          <w:sz w:val="20"/>
+        </w:rPr>
+        <w:t>Bibliography</w:t>
+      </w:r>
+      <w:r>
+        <w:rPr>
+          <w:rFonts w:ascii="Arial" w:hAnsi="Arial"/>
+          <w:b w:val="0"/>
+          <w:color w:val="000000"/>
+          <w:sz w:val="22"/>
+        </w:rPr>
+        <w:t>, and splits that section into candidate reference strings. For each cited reference, the script records the source PDF, reference text, DOI when present, URL when present, year, guessed authors, guessed title, and a stable reference key. A separate edge-list file records source PDF to cited-reference relationships for network analysis.</w:t>
+      </w:r>
+    </w:p>
+    <w:p>
+      <w:pPr>
+        <w:spacing w:after="160"/>
+      </w:pPr>
+      <w:r>
+        <w:rPr>
+          <w:rFonts w:ascii="Arial" w:hAnsi="Arial"/>
+          <w:b w:val="0"/>
+          <w:color w:val="000000"/>
+          <w:sz w:val="22"/>
+        </w:rPr>
+        <w:t>This phase is intended first as a track-down and network-building aid. Automated downloading should be limited to clearly open-access PDFs or files explicitly obtained through authorized user or library access. Paywalled literature should be recorded as DOI/URL/title candidates for manual retrieval through the user's museum library VPN or other authorized access route.</w:t>
+      </w:r>
+    </w:p>
     <w:sectPr>
       <w:pgSz w:w="12240" w:h="15840"/>
       <w:pgMar w:top="1440" w:right="1440" w:bottom="1440" w:left="1440" w:header="720" w:footer="720" w:gutter="0"/>

</xml_diff>

<commit_message>
Refresh Bates rerun workflow documentation
</commit_message>
<xml_diff>
--- a/BatLit_Pre-Zotero_Methods.docx
+++ b/BatLit_Pre-Zotero_Methods.docx
@@ -4,30 +4,17 @@
   <w:body>
     <w:p>
       <w:pPr>
-        <w:spacing w:after="60"/>
-        <w:jc w:val="left"/>
+        <w:pStyle w:val="Title"/>
       </w:pPr>
       <w:r>
-        <w:rPr>
-          <w:rFonts w:ascii="Arial" w:hAnsi="Arial"/>
-          <w:b w:val="0"/>
-          <w:color w:val="000000"/>
-          <w:sz w:val="52"/>
-        </w:rPr>
         <w:t>Running Methods: BatLit Pre-Zotero Deduplication Pipeline</w:t>
       </w:r>
     </w:p>
     <w:p>
       <w:pPr>
-        <w:spacing w:after="160"/>
+        <w:spacing w:after="120"/>
       </w:pPr>
       <w:r>
-        <w:rPr>
-          <w:rFonts w:ascii="Arial" w:hAnsi="Arial"/>
-          <w:b w:val="0"/>
-          <w:color w:val="000000"/>
-          <w:sz w:val="22"/>
-        </w:rPr>
         <w:t>This document records the evolving methods used to screen incoming literature collections before Zotero ingestion.</w:t>
       </w:r>
     </w:p>
@@ -41,52 +28,10 @@
     </w:p>
     <w:p>
       <w:pPr>
-        <w:spacing w:after="160"/>
+        <w:spacing w:after="120"/>
       </w:pPr>
       <w:r>
-        <w:rPr>
-          <w:rFonts w:ascii="Arial" w:hAnsi="Arial"/>
-          <w:b w:val="0"/>
-          <w:color w:val="000000"/>
-          <w:sz w:val="22"/>
-        </w:rPr>
-        <w:t xml:space="preserve">The current test collection is labeled </w:t>
-      </w:r>
-      <w:r>
-        <w:rPr>
-          <w:rFonts w:ascii="Courier New" w:hAnsi="Courier New"/>
-          <w:b w:val="0"/>
-          <w:color w:val="333333"/>
-          <w:sz w:val="20"/>
-        </w:rPr>
-        <w:t>Bates 2026</w:t>
-      </w:r>
-      <w:r>
-        <w:rPr>
-          <w:rFonts w:ascii="Arial" w:hAnsi="Arial"/>
-          <w:b w:val="0"/>
-          <w:color w:val="000000"/>
-          <w:sz w:val="22"/>
-        </w:rPr>
-        <w:t xml:space="preserve">, a set of PDFs shared by Paul Bates in 2026 and placed in </w:t>
-      </w:r>
-      <w:r>
-        <w:rPr>
-          <w:rFonts w:ascii="Courier New" w:hAnsi="Courier New"/>
-          <w:b w:val="0"/>
-          <w:color w:val="333333"/>
-          <w:sz w:val="20"/>
-        </w:rPr>
-        <w:t>batlit-dedupe/incoming/</w:t>
-      </w:r>
-      <w:r>
-        <w:rPr>
-          <w:rFonts w:ascii="Arial" w:hAnsi="Arial"/>
-          <w:b w:val="0"/>
-          <w:color w:val="000000"/>
-          <w:sz w:val="22"/>
-        </w:rPr>
-        <w:t>.</w:t>
+        <w:t>The current test collection is labeled `Bates 2026`, a set of PDFs shared by Paul Bates in 2026 and placed in `batlit-dedupe/incoming/`.</w:t>
       </w:r>
     </w:p>
     <w:p>
@@ -99,52 +44,10 @@
     </w:p>
     <w:p>
       <w:pPr>
-        <w:spacing w:after="160"/>
+        <w:spacing w:after="120"/>
       </w:pPr>
       <w:r>
-        <w:rPr>
-          <w:rFonts w:ascii="Arial" w:hAnsi="Arial"/>
-          <w:b w:val="0"/>
-          <w:color w:val="000000"/>
-          <w:sz w:val="22"/>
-        </w:rPr>
-        <w:t xml:space="preserve">We built a lightweight BatLit literature fingerprint index from the BatLit reference export </w:t>
-      </w:r>
-      <w:r>
-        <w:rPr>
-          <w:rFonts w:ascii="Courier New" w:hAnsi="Courier New"/>
-          <w:b w:val="0"/>
-          <w:color w:val="333333"/>
-          <w:sz w:val="20"/>
-        </w:rPr>
-        <w:t>index/refs.csv</w:t>
-      </w:r>
-      <w:r>
-        <w:rPr>
-          <w:rFonts w:ascii="Arial" w:hAnsi="Arial"/>
-          <w:b w:val="0"/>
-          <w:color w:val="000000"/>
-          <w:sz w:val="22"/>
-        </w:rPr>
-        <w:t xml:space="preserve">. The index is stored independently of Zotero as </w:t>
-      </w:r>
-      <w:r>
-        <w:rPr>
-          <w:rFonts w:ascii="Courier New" w:hAnsi="Courier New"/>
-          <w:b w:val="0"/>
-          <w:color w:val="333333"/>
-          <w:sz w:val="20"/>
-        </w:rPr>
-        <w:t>index/literature_fingerprint_index.csv</w:t>
-      </w:r>
-      <w:r>
-        <w:rPr>
-          <w:rFonts w:ascii="Arial" w:hAnsi="Arial"/>
-          <w:b w:val="0"/>
-          <w:color w:val="000000"/>
-          <w:sz w:val="22"/>
-        </w:rPr>
-        <w:t xml:space="preserve"> with timestamped archival copies. For each BatLit record, the index stores DOI, alternative DOI, title, normalized title, authors, normalized authors, first author, year, journal and publication fields, Zotero item URL, attachment identifiers, and extracted MD5 hashes where available. Placeholder columns are retained for future corpus-side page counts and first-page or first-three-page text fingerprints.</w:t>
+        <w:t>We built a lightweight BatLit literature fingerprint index from the BatLit reference export `index/refs.csv`. The index is stored independently of Zotero as `index/literature_fingerprint_index.csv` with timestamped archival copies. For each BatLit record, the index stores DOI, alternative DOI, title, normalized title, authors, normalized authors, first author, year, journal and publication fields, Zotero item URL, attachment identifiers, and extracted MD5 hashes where available. Placeholder columns are retained for future corpus-side page counts and first-page or first-three-page text fingerprints.</w:t>
       </w:r>
     </w:p>
     <w:p>
@@ -157,106 +60,10 @@
     </w:p>
     <w:p>
       <w:pPr>
-        <w:spacing w:after="160"/>
+        <w:spacing w:after="120"/>
       </w:pPr>
       <w:r>
-        <w:rPr>
-          <w:rFonts w:ascii="Arial" w:hAnsi="Arial"/>
-          <w:b w:val="0"/>
-          <w:color w:val="000000"/>
-          <w:sz w:val="22"/>
-        </w:rPr>
-        <w:t xml:space="preserve">Incoming PDFs are screened before Zotero import. The workflow computes MD5 and SHA256 hashes, extracts page count with </w:t>
-      </w:r>
-      <w:r>
-        <w:rPr>
-          <w:rFonts w:ascii="Courier New" w:hAnsi="Courier New"/>
-          <w:b w:val="0"/>
-          <w:color w:val="333333"/>
-          <w:sz w:val="20"/>
-        </w:rPr>
-        <w:t>pdfinfo</w:t>
-      </w:r>
-      <w:r>
-        <w:rPr>
-          <w:rFonts w:ascii="Arial" w:hAnsi="Arial"/>
-          <w:b w:val="0"/>
-          <w:color w:val="000000"/>
-          <w:sz w:val="22"/>
-        </w:rPr>
-        <w:t xml:space="preserve">, extracts text with </w:t>
-      </w:r>
-      <w:r>
-        <w:rPr>
-          <w:rFonts w:ascii="Courier New" w:hAnsi="Courier New"/>
-          <w:b w:val="0"/>
-          <w:color w:val="333333"/>
-          <w:sz w:val="20"/>
-        </w:rPr>
-        <w:t>pdftotext</w:t>
-      </w:r>
-      <w:r>
-        <w:rPr>
-          <w:rFonts w:ascii="Arial" w:hAnsi="Arial"/>
-          <w:b w:val="0"/>
-          <w:color w:val="000000"/>
-          <w:sz w:val="22"/>
-        </w:rPr>
-        <w:t xml:space="preserve">, and uses the first page to infer title, authors, and year. DOI candidates are extracted from the first three pages. Full extracted text is also scanned for bat-relevance terms, including </w:t>
-      </w:r>
-      <w:r>
-        <w:rPr>
-          <w:rFonts w:ascii="Courier New" w:hAnsi="Courier New"/>
-          <w:b w:val="0"/>
-          <w:color w:val="333333"/>
-          <w:sz w:val="20"/>
-        </w:rPr>
-        <w:t>bat</w:t>
-      </w:r>
-      <w:r>
-        <w:rPr>
-          <w:rFonts w:ascii="Arial" w:hAnsi="Arial"/>
-          <w:b w:val="0"/>
-          <w:color w:val="000000"/>
-          <w:sz w:val="22"/>
-        </w:rPr>
-        <w:t xml:space="preserve">, </w:t>
-      </w:r>
-      <w:r>
-        <w:rPr>
-          <w:rFonts w:ascii="Courier New" w:hAnsi="Courier New"/>
-          <w:b w:val="0"/>
-          <w:color w:val="333333"/>
-          <w:sz w:val="20"/>
-        </w:rPr>
-        <w:t>bats</w:t>
-      </w:r>
-      <w:r>
-        <w:rPr>
-          <w:rFonts w:ascii="Arial" w:hAnsi="Arial"/>
-          <w:b w:val="0"/>
-          <w:color w:val="000000"/>
-          <w:sz w:val="22"/>
-        </w:rPr>
-        <w:t xml:space="preserve">, and </w:t>
-      </w:r>
-      <w:r>
-        <w:rPr>
-          <w:rFonts w:ascii="Courier New" w:hAnsi="Courier New"/>
-          <w:b w:val="0"/>
-          <w:color w:val="333333"/>
-          <w:sz w:val="20"/>
-        </w:rPr>
-        <w:t>chiroptera</w:t>
-      </w:r>
-      <w:r>
-        <w:rPr>
-          <w:rFonts w:ascii="Arial" w:hAnsi="Arial"/>
-          <w:b w:val="0"/>
-          <w:color w:val="000000"/>
-          <w:sz w:val="22"/>
-        </w:rPr>
-        <w:t>, and for non-bat context terms.</w:t>
+        <w:t>Incoming PDFs are screened before Zotero import. The workflow computes MD5 and SHA256 hashes, extracts page count with `pdfinfo`, extracts text with `pdftotext`, and uses the first page to infer title, authors, and year. DOI candidates are extracted from the first three pages. Full extracted text is also scanned for bat-relevance terms, including `bat`, `bats`, and `chiroptera`, and for non-bat context terms.</w:t>
       </w:r>
     </w:p>
     <w:p>
@@ -269,15 +76,9 @@
     </w:p>
     <w:p>
       <w:pPr>
-        <w:spacing w:after="160"/>
+        <w:spacing w:after="120"/>
       </w:pPr>
       <w:r>
-        <w:rPr>
-          <w:rFonts w:ascii="Arial" w:hAnsi="Arial"/>
-          <w:b w:val="0"/>
-          <w:color w:val="000000"/>
-          <w:sz w:val="22"/>
-        </w:rPr>
         <w:t>Incoming PDFs are first compared with the BatLit corpus using exact MD5 hash matches, DOI matches from front matter, and normalized title/author/year matches. The workflow also compares PDFs within the current incoming batch using the same evidence classes. Exact hash and DOI matches are treated as confirmed duplicates. Title/author/year matches are treated as likely duplicates for manual review. The report records whether a match came from the BatLit corpus or from the current incoming batch.</w:t>
       </w:r>
     </w:p>
@@ -291,124 +92,10 @@
     </w:p>
     <w:p>
       <w:pPr>
-        <w:spacing w:after="160"/>
+        <w:spacing w:after="120"/>
       </w:pPr>
       <w:r>
-        <w:rPr>
-          <w:rFonts w:ascii="Arial" w:hAnsi="Arial"/>
-          <w:b w:val="0"/>
-          <w:color w:val="000000"/>
-          <w:sz w:val="22"/>
-        </w:rPr>
-        <w:t xml:space="preserve">After screening, files are copied into timestamped </w:t>
-      </w:r>
-      <w:r>
-        <w:rPr>
-          <w:rFonts w:ascii="Courier New" w:hAnsi="Courier New"/>
-          <w:b w:val="0"/>
-          <w:color w:val="333333"/>
-          <w:sz w:val="20"/>
-        </w:rPr>
-        <w:t>processed_runs/</w:t>
-      </w:r>
-      <w:r>
-        <w:rPr>
-          <w:rFonts w:ascii="Arial" w:hAnsi="Arial"/>
-          <w:b w:val="0"/>
-          <w:color w:val="000000"/>
-          <w:sz w:val="22"/>
-        </w:rPr>
-        <w:t xml:space="preserve"> folders. Confirmed duplicates are routed to </w:t>
-      </w:r>
-      <w:r>
-        <w:rPr>
-          <w:rFonts w:ascii="Courier New" w:hAnsi="Courier New"/>
-          <w:b w:val="0"/>
-          <w:color w:val="333333"/>
-          <w:sz w:val="20"/>
-        </w:rPr>
-        <w:t>duplicates/</w:t>
-      </w:r>
-      <w:r>
-        <w:rPr>
-          <w:rFonts w:ascii="Arial" w:hAnsi="Arial"/>
-          <w:b w:val="0"/>
-          <w:color w:val="000000"/>
-          <w:sz w:val="22"/>
-        </w:rPr>
-        <w:t xml:space="preserve">; high-confidence possible duplicates are routed to </w:t>
-      </w:r>
-      <w:r>
-        <w:rPr>
-          <w:rFonts w:ascii="Courier New" w:hAnsi="Courier New"/>
-          <w:b w:val="0"/>
-          <w:color w:val="333333"/>
-          <w:sz w:val="20"/>
-        </w:rPr>
-        <w:t>likely_duplicates/</w:t>
-      </w:r>
-      <w:r>
-        <w:rPr>
-          <w:rFonts w:ascii="Arial" w:hAnsi="Arial"/>
-          <w:b w:val="0"/>
-          <w:color w:val="000000"/>
-          <w:sz w:val="22"/>
-        </w:rPr>
-        <w:t xml:space="preserve">; new candidate literature is routed to </w:t>
-      </w:r>
-      <w:r>
-        <w:rPr>
-          <w:rFonts w:ascii="Courier New" w:hAnsi="Courier New"/>
-          <w:b w:val="0"/>
-          <w:color w:val="333333"/>
-          <w:sz w:val="20"/>
-        </w:rPr>
-        <w:t>new_literature/</w:t>
-      </w:r>
-      <w:r>
-        <w:rPr>
-          <w:rFonts w:ascii="Arial" w:hAnsi="Arial"/>
-          <w:b w:val="0"/>
-          <w:color w:val="000000"/>
-          <w:sz w:val="22"/>
-        </w:rPr>
-        <w:t xml:space="preserve">; and likely out-of-scope items are routed to </w:t>
-      </w:r>
-      <w:r>
-        <w:rPr>
-          <w:rFonts w:ascii="Courier New" w:hAnsi="Courier New"/>
-          <w:b w:val="0"/>
-          <w:color w:val="333333"/>
-          <w:sz w:val="20"/>
-        </w:rPr>
-        <w:t>non_bat_review/</w:t>
-      </w:r>
-      <w:r>
-        <w:rPr>
-          <w:rFonts w:ascii="Arial" w:hAnsi="Arial"/>
-          <w:b w:val="0"/>
-          <w:color w:val="000000"/>
-          <w:sz w:val="22"/>
-        </w:rPr>
-        <w:t xml:space="preserve">. For Bates 2026, no files had text-extraction errors and no </w:t>
-      </w:r>
-      <w:r>
-        <w:rPr>
-          <w:rFonts w:ascii="Courier New" w:hAnsi="Courier New"/>
-          <w:b w:val="0"/>
-          <w:color w:val="333333"/>
-          <w:sz w:val="20"/>
-        </w:rPr>
-        <w:t>failed_processing/</w:t>
-      </w:r>
-      <w:r>
-        <w:rPr>
-          <w:rFonts w:ascii="Arial" w:hAnsi="Arial"/>
-          <w:b w:val="0"/>
-          <w:color w:val="000000"/>
-          <w:sz w:val="22"/>
-        </w:rPr>
-        <w:t xml:space="preserve"> folder was produced.</w:t>
+        <w:t>After screening, files are copied into timestamped `processed_runs/` folders. Confirmed duplicates are routed to `duplicates/`; high-confidence possible duplicates are routed to `likely_duplicates/`; new candidate literature is routed to `new_literature/`; and likely out-of-scope items are routed to `non_bat_review/`. For Bates 2026, no files had text-extraction errors and no `failed_processing/` folder was produced.</w:t>
       </w:r>
     </w:p>
     <w:p>
@@ -421,52 +108,10 @@
     </w:p>
     <w:p>
       <w:pPr>
-        <w:spacing w:after="160"/>
+        <w:spacing w:after="120"/>
       </w:pPr>
       <w:r>
-        <w:rPr>
-          <w:rFonts w:ascii="Arial" w:hAnsi="Arial"/>
-          <w:b w:val="0"/>
-          <w:color w:val="000000"/>
-          <w:sz w:val="22"/>
-        </w:rPr>
-        <w:t xml:space="preserve">For Bates 2026, confirmed duplicates were omitted from the next-stage review folders. The folder </w:t>
-      </w:r>
-      <w:r>
-        <w:rPr>
-          <w:rFonts w:ascii="Courier New" w:hAnsi="Courier New"/>
-          <w:b w:val="0"/>
-          <w:color w:val="333333"/>
-          <w:sz w:val="20"/>
-        </w:rPr>
-        <w:t>Deduplicated_new_literature/</w:t>
-      </w:r>
-      <w:r>
-        <w:rPr>
-          <w:rFonts w:ascii="Arial" w:hAnsi="Arial"/>
-          <w:b w:val="0"/>
-          <w:color w:val="000000"/>
-          <w:sz w:val="22"/>
-        </w:rPr>
-        <w:t xml:space="preserve"> contains candidate new literature for metadata review and Zotero ingestion. The folder </w:t>
-      </w:r>
-      <w:r>
-        <w:rPr>
-          <w:rFonts w:ascii="Courier New" w:hAnsi="Courier New"/>
-          <w:b w:val="0"/>
-          <w:color w:val="333333"/>
-          <w:sz w:val="20"/>
-        </w:rPr>
-        <w:t>Deduplicated_likely_duplicates/</w:t>
-      </w:r>
-      <w:r>
-        <w:rPr>
-          <w:rFonts w:ascii="Arial" w:hAnsi="Arial"/>
-          <w:b w:val="0"/>
-          <w:color w:val="000000"/>
-          <w:sz w:val="22"/>
-        </w:rPr>
-        <w:t xml:space="preserve"> contains possible duplicates that should be reviewed manually before any Zotero import. Manifests are written inside each folder and as a combined run-level manifest.</w:t>
+        <w:t>For Bates 2026, confirmed duplicates were omitted from the next-stage review folders. The folder `Deduplicated_new_literature/` contains candidate new literature for metadata review and Zotero ingestion. The folder `Deduplicated_likely_duplicates/` contains possible duplicates that should be reviewed manually before any Zotero import. Manifests are written inside each folder and as a combined run-level manifest.</w:t>
       </w:r>
     </w:p>
     <w:p>
@@ -479,15 +124,9 @@
     </w:p>
     <w:p>
       <w:pPr>
-        <w:spacing w:after="160"/>
+        <w:spacing w:after="120"/>
       </w:pPr>
       <w:r>
-        <w:rPr>
-          <w:rFonts w:ascii="Arial" w:hAnsi="Arial"/>
-          <w:b w:val="0"/>
-          <w:color w:val="000000"/>
-          <w:sz w:val="22"/>
-        </w:rPr>
         <w:t>After routing, bibliography metadata is embedded into the routed PDF copies using PDF document information fields. Embedded fields include title, author, DOI, year, BatLit decision, decision reason, original filename, hashes, and Zotero/BatLit match identifiers where available. This step is intended to make the routed PDFs easier to inspect and import into Zotero while preserving separate CSV/XLSX audit records.</w:t>
       </w:r>
     </w:p>
@@ -501,16 +140,42 @@
     </w:p>
     <w:p>
       <w:pPr>
-        <w:spacing w:after="160"/>
+        <w:spacing w:after="120"/>
       </w:pPr>
       <w:r>
-        <w:rPr>
-          <w:rFonts w:ascii="Arial" w:hAnsi="Arial"/>
-          <w:b w:val="0"/>
-          <w:color w:val="000000"/>
-          <w:sz w:val="22"/>
-        </w:rPr>
         <w:t>The pipeline writes CSV and XLSX bibliographies for each routed folder, collection-level action logs, routing reports, dedupe reports, metadata embedding reports, and timestamped manifests. These files preserve the decisions made for each PDF and allow later reconstruction of what was added, excluded, or sent to manual review.</w:t>
+      </w:r>
+    </w:p>
+    <w:p>
+      <w:pPr>
+        <w:pStyle w:val="Heading1"/>
+      </w:pPr>
+      <w:r>
+        <w:t>Clean Rerun and Archive Policy</w:t>
+      </w:r>
+    </w:p>
+    <w:p>
+      <w:pPr>
+        <w:spacing w:after="120"/>
+      </w:pPr>
+      <w:r>
+        <w:t>When a collection is reprocessed, the original incoming batch is treated as the source of truth and the full sequence is rerun: deduplication, routing, metadata embedding, curated metadata fallback, derived-folder synchronization, deduplicated review manifest creation, and collection action-log generation. Derived folders are not edited as independent sources; they are refreshed from the routed folders after metadata improvement.</w:t>
+      </w:r>
+    </w:p>
+    <w:p>
+      <w:pPr>
+        <w:spacing w:after="120"/>
+      </w:pPr>
+      <w:r>
+        <w:t>For the Bates 2026 rerun on 2026-06-29, the active run folder is `processed_runs/20260629_111835_Bates_2026_rerun/`. The run retained 544 confirmed duplicates, 93 likely duplicates, 2,472 candidate new-literature PDFs, and 394 non-bat review PDFs. The Zotero upload set is `processed_runs/20260629_111835_Bates_2026_rerun/20260629_114341_zotero_upload/`, containing the metadata-enhanced new-literature PDFs only.</w:t>
+      </w:r>
+    </w:p>
+    <w:p>
+      <w:pPr>
+        <w:spacing w:after="120"/>
+      </w:pPr>
+      <w:r>
+        <w:t>Superseded outputs are preserved under `archive/` rather than deleted. When Windows or Dropbox prevents moving a large folder, a non-destructive archive copy is created and the original is marked with `_SUPERSEDED_DO_NOT_USE.txt` until it can be retired.</w:t>
       </w:r>
     </w:p>
     <w:p>
@@ -523,89 +188,23 @@
     </w:p>
     <w:p>
       <w:pPr>
-        <w:spacing w:after="160"/>
+        <w:spacing w:after="120"/>
       </w:pPr>
       <w:r>
-        <w:rPr>
-          <w:rFonts w:ascii="Arial" w:hAnsi="Arial"/>
-          <w:b w:val="0"/>
-          <w:color w:val="000000"/>
-          <w:sz w:val="22"/>
-        </w:rPr>
-        <w:t xml:space="preserve">A citation-network phase was added as an optional downstream step. The workflow scans duplicate-omitted review sets, extracts full text, identifies the cited-reference section using common headings such as </w:t>
-      </w:r>
-      <w:r>
-        <w:rPr>
-          <w:rFonts w:ascii="Courier New" w:hAnsi="Courier New"/>
-          <w:b w:val="0"/>
-          <w:color w:val="333333"/>
-          <w:sz w:val="20"/>
-        </w:rPr>
-        <w:t>References</w:t>
-      </w:r>
-      <w:r>
-        <w:rPr>
-          <w:rFonts w:ascii="Arial" w:hAnsi="Arial"/>
-          <w:b w:val="0"/>
-          <w:color w:val="000000"/>
-          <w:sz w:val="22"/>
-        </w:rPr>
-        <w:t xml:space="preserve">, </w:t>
-      </w:r>
-      <w:r>
-        <w:rPr>
-          <w:rFonts w:ascii="Courier New" w:hAnsi="Courier New"/>
-          <w:b w:val="0"/>
-          <w:color w:val="333333"/>
-          <w:sz w:val="20"/>
-        </w:rPr>
-        <w:t>Literature cited</w:t>
-      </w:r>
-      <w:r>
-        <w:rPr>
-          <w:rFonts w:ascii="Arial" w:hAnsi="Arial"/>
-          <w:b w:val="0"/>
-          <w:color w:val="000000"/>
-          <w:sz w:val="22"/>
-        </w:rPr>
-        <w:t xml:space="preserve">, and </w:t>
-      </w:r>
-      <w:r>
-        <w:rPr>
-          <w:rFonts w:ascii="Courier New" w:hAnsi="Courier New"/>
-          <w:b w:val="0"/>
-          <w:color w:val="333333"/>
-          <w:sz w:val="20"/>
-        </w:rPr>
-        <w:t>Bibliography</w:t>
-      </w:r>
-      <w:r>
-        <w:rPr>
-          <w:rFonts w:ascii="Arial" w:hAnsi="Arial"/>
-          <w:b w:val="0"/>
-          <w:color w:val="000000"/>
-          <w:sz w:val="22"/>
-        </w:rPr>
-        <w:t>, and splits that section into candidate reference strings. For each cited reference, the script records the source PDF, reference text, DOI when present, URL when present, year, guessed authors, guessed title, and a stable reference key. A separate edge-list file records source PDF to cited-reference relationships for network analysis.</w:t>
+        <w:t>A citation-network phase was added as an optional downstream step. The workflow scans duplicate-omitted review sets, extracts full text, identifies the cited-reference section using common headings such as `References`, `Literature cited`, and `Bibliography`, and splits that section into candidate reference strings. For each cited reference, the script records the source PDF, reference text, DOI when present, URL when present, year, guessed authors, guessed title, and a stable reference key. A separate edge-list file records source PDF to cited-reference relationships for network analysis.</w:t>
       </w:r>
     </w:p>
     <w:p>
       <w:pPr>
-        <w:spacing w:after="160"/>
+        <w:spacing w:after="120"/>
       </w:pPr>
       <w:r>
-        <w:rPr>
-          <w:rFonts w:ascii="Arial" w:hAnsi="Arial"/>
-          <w:b w:val="0"/>
-          <w:color w:val="000000"/>
-          <w:sz w:val="22"/>
-        </w:rPr>
         <w:t>This phase is intended first as a track-down and network-building aid. Automated downloading should be limited to clearly open-access PDFs or files explicitly obtained through authorized user or library access. Paywalled literature should be recorded as DOI/URL/title candidates for manual retrieval through the user's museum library VPN or other authorized access route.</w:t>
       </w:r>
     </w:p>
     <w:sectPr>
       <w:pgSz w:w="12240" w:h="15840"/>
-      <w:pgMar w:top="1440" w:right="1440" w:bottom="1440" w:left="1440" w:header="720" w:footer="720" w:gutter="0"/>
+      <w:pgMar w:top="1440" w:right="1800" w:bottom="1440" w:left="1800" w:header="720" w:footer="720" w:gutter="0"/>
       <w:cols w:space="720"/>
       <w:docGrid w:linePitch="360"/>
     </w:sectPr>
@@ -976,12 +575,9 @@
     <w:name w:val="Normal"/>
     <w:qFormat/>
     <w:rsid w:val="00FC693F"/>
-    <w:pPr>
-      <w:spacing w:after="160" w:line="276" w:lineRule="auto"/>
-    </w:pPr>
     <w:rPr>
       <w:rFonts w:ascii="Arial" w:hAnsi="Arial"/>
-      <w:sz w:val="22"/>
+      <w:sz w:val="21"/>
     </w:rPr>
   </w:style>
   <w:style w:type="paragraph" w:styleId="Header">
@@ -1039,15 +635,15 @@
     <w:pPr>
       <w:keepNext/>
       <w:keepLines/>
-      <w:spacing w:before="400" w:after="120" w:line="276" w:lineRule="auto"/>
+      <w:spacing w:before="480" w:after="0"/>
       <w:outlineLvl w:val="0"/>
     </w:pPr>
     <w:rPr>
       <w:rFonts w:asciiTheme="majorHAnsi" w:eastAsiaTheme="majorEastAsia" w:hAnsiTheme="majorHAnsi" w:cstheme="majorBidi" w:ascii="Arial" w:hAnsi="Arial"/>
-      <w:b w:val="0"/>
+      <w:b/>
       <w:bCs/>
-      <w:color w:val="000000"/>
-      <w:sz w:val="40"/>
+      <w:color w:val="365F91" w:themeColor="accent1" w:themeShade="BF"/>
+      <w:sz w:val="32"/>
       <w:szCs w:val="28"/>
     </w:rPr>
   </w:style>
@@ -1063,15 +659,15 @@
     <w:pPr>
       <w:keepNext/>
       <w:keepLines/>
-      <w:spacing w:before="360" w:after="120" w:line="276" w:lineRule="auto"/>
+      <w:spacing w:before="200" w:after="0"/>
       <w:outlineLvl w:val="1"/>
     </w:pPr>
     <w:rPr>
       <w:rFonts w:asciiTheme="majorHAnsi" w:eastAsiaTheme="majorEastAsia" w:hAnsiTheme="majorHAnsi" w:cstheme="majorBidi" w:ascii="Arial" w:hAnsi="Arial"/>
-      <w:b w:val="0"/>
+      <w:b/>
       <w:bCs/>
-      <w:color w:val="000000"/>
-      <w:sz w:val="32"/>
+      <w:color w:val="4F81BD" w:themeColor="accent1"/>
+      <w:sz w:val="24"/>
       <w:szCs w:val="26"/>
     </w:rPr>
   </w:style>
@@ -1087,15 +683,14 @@
     <w:pPr>
       <w:keepNext/>
       <w:keepLines/>
-      <w:spacing w:before="320" w:after="80" w:line="276" w:lineRule="auto"/>
+      <w:spacing w:before="200" w:after="0"/>
       <w:outlineLvl w:val="2"/>
     </w:pPr>
     <w:rPr>
-      <w:rFonts w:asciiTheme="majorHAnsi" w:eastAsiaTheme="majorEastAsia" w:hAnsiTheme="majorHAnsi" w:cstheme="majorBidi" w:ascii="Arial" w:hAnsi="Arial"/>
-      <w:b w:val="0"/>
+      <w:rFonts w:asciiTheme="majorHAnsi" w:eastAsiaTheme="majorEastAsia" w:hAnsiTheme="majorHAnsi" w:cstheme="majorBidi"/>
+      <w:b/>
       <w:bCs/>
-      <w:color w:val="434343"/>
-      <w:sz w:val="28"/>
+      <w:color w:val="4F81BD" w:themeColor="accent1"/>
     </w:rPr>
   </w:style>
   <w:style w:type="paragraph" w:styleId="Heading4">

</xml_diff>

<commit_message>
Tighten Zotero-ready metadata gating
</commit_message>
<xml_diff>
--- a/BatLit_Pre-Zotero_Methods.docx
+++ b/BatLit_Pre-Zotero_Methods.docx
@@ -200,6 +200,24 @@
       </w:pPr>
       <w:r>
         <w:t>This phase is intended first as a track-down and network-building aid. Automated downloading should be limited to clearly open-access PDFs or files explicitly obtained through authorized user or library access. Paywalled literature should be recorded as DOI/URL/title candidates for manual retrieval through the user's museum library VPN or other authorized access route.</w:t>
+      </w:r>
+    </w:p>
+    <w:p>
+      <w:pPr>
+        <w:pStyle w:val="Heading2"/>
+      </w:pPr>
+      <w:r>
+        <w:t>Strict Zotero-Ready Metadata Gate</w:t>
+      </w:r>
+    </w:p>
+    <w:p>
+      <w:r>
+        <w:t>As of the 2026-08-27 AMNH rebuild, the final Zotero-facing folder is rebuilt from the curated embedded metadata report rather than preliminary routed filenames or noisy OCR guesses. A PDF is considered Zotero ready only when the report records status=embedded and confidence=curated, verified, or high. PDFs with unknown authors, placeholder titles, suspicious taxonomic years, or unverified MDD/search clues remain in Needs_Metadata_Investigation_PDFs until citation evidence is confirmed and embedded.</w:t>
+      </w:r>
+    </w:p>
+    <w:p>
+      <w:r>
+        <w:t>For AMNH_20260827, this stricter gate placed only the curated Koopman 1988 chapter in Zotero_Ready_PDFs and moved the other 24 PDFs into Needs_Metadata_Investigation_PDFs. The investigation folder includes queue/manifests so remaining records can be resolved using first-3-page evidence, first-10-page fallback, rendered title pages, annotations, MDD/HMW clue lists, and targeted online searches.</w:t>
       </w:r>
     </w:p>
     <w:sectPr>

</xml_diff>

<commit_message>
Document AMNH pass and Plazi BHL prior art
</commit_message>
<xml_diff>
--- a/BatLit_Pre-Zotero_Methods.docx
+++ b/BatLit_Pre-Zotero_Methods.docx
@@ -218,6 +218,24 @@
     <w:p>
       <w:r>
         <w:t>For AMNH_20260827, this stricter gate placed only the curated Koopman 1988 chapter in Zotero_Ready_PDFs and moved the other 24 PDFs into Needs_Metadata_Investigation_PDFs. The investigation folder includes queue/manifests so remaining records can be resolved using first-3-page evidence, first-10-page fallback, rendered title pages, annotations, MDD/HMW clue lists, and targeted online searches.</w:t>
+      </w:r>
+    </w:p>
+    <w:p>
+      <w:pPr>
+        <w:pStyle w:val="Heading2"/>
+      </w:pPr>
+      <w:r>
+        <w:t>AMNH Pass-1 Metadata Enrichment and External Infrastructure</w:t>
+      </w:r>
+    </w:p>
+    <w:p>
+      <w:r>
+        <w:t>On 2026-08-27, the AMNH citation-resolution pass used local first-page and first-ten-page evidence plus MDD, BHL, Zenodo, Google Books, INIST/Pascal, and indexed scholarly reference lists to embed richer metadata into 21 additional PDFs. Together with the previously curated Koopman 1988 chapter, the active AMNH Zotero-ready set now contains 22 metadata-embedded PDFs. Three records remain in Needs_Metadata_Investigation_PDFs until enough evidence exists for safe embedding.</w:t>
+      </w:r>
+    </w:p>
+    <w:p>
+      <w:r>
+        <w:t>The workflow will treat Plazi TreatmentBank, the Zenodo Biodiversity Literature Repository, RefBank, GoldenGATE Imagine, and the BHL API as authority and provenance layers for future metadata resolution. These systems inform citation matching, OCR/text extraction, FAIR identifiers, and treatment-level provenance, but BatLit still records evidence and embeds only high-confidence, curated, or verified metadata. Superseded AMNH pass folders and stale queues are archived under batlit-dedupe/archive/ so active folders reflect the current state.</w:t>
       </w:r>
     </w:p>
     <w:sectPr>

</xml_diff>

<commit_message>
Add Zotero import package builder
</commit_message>
<xml_diff>
--- a/BatLit_Pre-Zotero_Methods.docx
+++ b/BatLit_Pre-Zotero_Methods.docx
@@ -236,6 +236,24 @@
     <w:p>
       <w:r>
         <w:t>The workflow will treat Plazi TreatmentBank, the Zenodo Biodiversity Literature Repository, RefBank, GoldenGATE Imagine, and the BHL API as authority and provenance layers for future metadata resolution. These systems inform citation matching, OCR/text extraction, FAIR identifiers, and treatment-level provenance, but BatLit still records evidence and embeds only high-confidence, curated, or verified metadata. Superseded AMNH pass folders and stale queues are archived under batlit-dedupe/archive/ so active folders reflect the current state.</w:t>
+      </w:r>
+    </w:p>
+    <w:p>
+      <w:pPr>
+        <w:pStyle w:val="Heading2"/>
+      </w:pPr>
+      <w:r>
+        <w:t>Zotero Import Package Correction</w:t>
+      </w:r>
+    </w:p>
+    <w:p>
+      <w:r>
+        <w:t>AMNH Zotero testing showed that embedded PDF document properties alone are not sufficient for many scanned historical items. Zotero metadata retrieval primarily depends on first-page text and online identifier or bibliographic lookups, so older scans may remain standalone attachments even when curated document-info metadata is present.</w:t>
+      </w:r>
+    </w:p>
+    <w:p>
+      <w:r>
+        <w:t>The pipeline now creates a Zotero import package for curated batches. The package keeps metadata-enhanced PDFs together with a single RIS file, BibTeX file, CSV manifest, and import README. For weak Zotero recognition cases, the preferred ingestion path is Zotero File &gt; Import on the RIS file rather than dragging PDFs alone.</w:t>
       </w:r>
     </w:p>
     <w:sectPr>

</xml_diff>

<commit_message>
Improve Zotero RIS metadata fields
</commit_message>
<xml_diff>
--- a/BatLit_Pre-Zotero_Methods.docx
+++ b/BatLit_Pre-Zotero_Methods.docx
@@ -254,6 +254,24 @@
     <w:p>
       <w:r>
         <w:t>The pipeline now creates a Zotero import package for curated batches. The package keeps metadata-enhanced PDFs together with a single RIS file, BibTeX file, CSV manifest, and import README. For weak Zotero recognition cases, the preferred ingestion path is Zotero File &gt; Import on the RIS file rather than dragging PDFs alone.</w:t>
+      </w:r>
+    </w:p>
+    <w:p>
+      <w:pPr>
+        <w:pStyle w:val="Heading2"/>
+      </w:pPr>
+      <w:r>
+        <w:t>RIS Field Correction After Zotero Test</w:t>
+      </w:r>
+    </w:p>
+    <w:p>
+      <w:r>
+        <w:t>Manual Zotero testing showed that some imported parent items retained only titles even when the curated CSV contained fuller metadata. The RIS exporter was revised to write more Zotero-friendly journal fields, including T1, T2, JF, JO, JA, PY, Y1, split start and end pages, and N2 abstracts.</w:t>
+      </w:r>
+    </w:p>
+    <w:p>
+      <w:r>
+        <w:t>The Lazell and Koopman 1985 Florida Scientist paper was used as the debugging example. Its first two PDF pages contained the citation clues, and the JSTOR stable record https://www.jstor.org/stable/24319878 confirmed the full citation. The resolved CSV, RIS package, manifest, and embedded PDF provenance were updated to prefer the JSTOR stable record.</w:t>
       </w:r>
     </w:p>
     <w:sectPr>

</xml_diff>

<commit_message>
Add AMNH online availability audit gate
</commit_message>
<xml_diff>
--- a/BatLit_Pre-Zotero_Methods.docx
+++ b/BatLit_Pre-Zotero_Methods.docx
@@ -272,6 +272,24 @@
     <w:p>
       <w:r>
         <w:t>The Lazell and Koopman 1985 Florida Scientist paper was used as the debugging example. Its first two PDF pages contained the citation clues, and the JSTOR stable record https://www.jstor.org/stable/24319878 confirmed the full citation. The resolved CSV, RIS package, manifest, and embedded PDF provenance were updated to prefer the JSTOR stable record.</w:t>
+      </w:r>
+    </w:p>
+    <w:p>
+      <w:pPr>
+        <w:pStyle w:val="Heading2"/>
+      </w:pPr>
+      <w:r>
+        <w:t>Online Availability Audit Gate</w:t>
+      </w:r>
+    </w:p>
+    <w:p>
+      <w:r>
+        <w:t>The AMNH test batch exposed a missing workflow gate. Before any AMNH or taxonomic-history scan is treated as unique, Zotero-ready, or final new literature, the pipeline must run an online availability audit using citation evidence rather than PDF metadata alone. The audit records whether each citation is already in BatLit/Zotero/Zenodo, has a JSTOR stable record, has a BHL/BioStor/Internet Archive scan candidate, has online metadata or identifiers, has only low-confidence API candidates, or still requires manual review.</w:t>
+      </w:r>
+    </w:p>
+    <w:p>
+      <w:r>
+        <w:t>Crossref, OpenAlex, and Internet Archive results are now normalized and title-similarity scored before acceptance. Low-similarity API results remain review candidates and are not treated as evidence. For the AMNH 2026-08-27 batch, Lazell and Koopman 1985 is recorded as a JSTOR stable-record case, while Dobson 1878 is recorded as already in BatLit. No future AMNH scan should be called new literature or Zotero-ready until online availability and scan value are recorded.</w:t>
       </w:r>
     </w:p>
     <w:sectPr>

</xml_diff>